<commit_message>
Architecture diagrams: add bottom margin so nothing is clipped
Increased both SVG canvases (external 780->810, internal 860->895) so the
bottom-most elements (the no-inbound-path note; the job-lifecycle strip) sit
clear of the edge, re-rendered the PNGs, and rebuilt the Word doc with the
taller figures.
</commit_message>
<xml_diff>
--- a/SOLANGE_System_Architecture_Guide.docx
+++ b/SOLANGE_System_Architecture_Guide.docx
@@ -80,7 +80,7 @@
       <w:r>
         <w:drawing>
           <wp:inline distT="0" distB="0" distL="0" distR="0">
-            <wp:extent cx="5715000" cy="3781425"/>
+            <wp:extent cx="5715000" cy="3924300"/>
             <wp:effectExtent t="0" r="0" b="0" l="0"/>
             <wp:docPr id="1" name="" descr="" title=""/>
             <wp:cNvGraphicFramePr>
@@ -105,7 +105,7 @@
                   <pic:spPr bwMode="auto">
                     <a:xfrm>
                       <a:off x="0" y="0"/>
-                      <a:ext cx="5715000" cy="3781425"/>
+                      <a:ext cx="5715000" cy="3924300"/>
                     </a:xfrm>
                     <a:prstGeom prst="rect">
                       <a:avLst/>
@@ -891,7 +891,7 @@
       <w:r>
         <w:drawing>
           <wp:inline distT="0" distB="0" distL="0" distR="0">
-            <wp:extent cx="5715000" cy="4095750"/>
+            <wp:extent cx="5715000" cy="4267200"/>
             <wp:effectExtent t="0" r="0" b="0" l="0"/>
             <wp:docPr id="1" name="" descr="" title=""/>
             <wp:cNvGraphicFramePr>
@@ -916,7 +916,7 @@
                   <pic:spPr bwMode="auto">
                     <a:xfrm>
                       <a:off x="0" y="0"/>
-                      <a:ext cx="5715000" cy="4095750"/>
+                      <a:ext cx="5715000" cy="4267200"/>
                     </a:xfrm>
                     <a:prstGeom prst="rect">
                       <a:avLst/>

</xml_diff>